<commit_message>
Align WF1-WF7 BRDs with wireframes: color fix, Concept Drift Abs+Delta, ACC 3-tile homepage, WF6 13-component numbering, WF7 5-screen structure
</commit_message>
<xml_diff>
--- a/WF1_Manage_Model_Inventory_BRD.docx
+++ b/WF1_Manage_Model_Inventory_BRD.docx
@@ -8265,7 +8265,7 @@
                 <w:sz w:val="20"/>
                 <w:szCs w:val="20"/>
               </w:rPr>
-              <w:t>Calendar days remaining until the next monitoring obligation, expressed relative to the monitoring period (e.g. 7 days / 90d for a quarterly model). Colour-coded per section 4.1.4: default neutral when &gt;= 10% of the period remains; amber/orange when &lt; 10% of the frequency window remains; red when overdue (value &lt; 0).</w:t>
+              <w:t>Calendar days remaining until the next monitoring obligation, expressed relative to the monitoring period (e.g. 7 days / 90d for a quarterly model). Colour-coded per section 4.1.4: default neutral when &gt;= 10% of the period remains; orange when &lt; 10% of the frequency window remains; red when overdue (value &lt; 0).</w:t>
             </w:r>
           </w:p>
         </w:tc>
@@ -9107,7 +9107,7 @@
                 <w:sz w:val="20"/>
                 <w:szCs w:val="20"/>
               </w:rPr>
-              <w:t>The list shall support multi-column filtering on Category, Sub Category 1, Sub Category 2, Modelling Technique, Monitoring Frequency, and Due Time / Duration status (Default / Amber / Red).</w:t>
+              <w:t>The list shall support multi-column filtering on Category, Sub Category 1, Sub Category 2, Modelling Technique, Monitoring Frequency, and Due Time / Duration status (Default / Orange / Red).</w:t>
             </w:r>
           </w:p>
         </w:tc>
@@ -10581,7 +10581,7 @@
         <w:rPr>
           <w:rFonts w:ascii="Arial" w:cs="Arial" w:eastAsia="Arial" w:hAnsi="Arial"/>
         </w:rPr>
-        <w:t>The inventory list displays two separate date-related columns for each model. The Due Date column shows the absolute calendar date of the next monitoring obligation, computed as Monitoring Start Date plus Monitoring Frequency and recalculated after each successful monitoring run. The Due Time / Duration column shows the days remaining until that obligation expressed relative to the monitoring period (e.g. "7 days / 90d" for a quarterly model with 7 days to go). The colour-coding logic for Due Time / Duration is: default neutral when &gt;= 10% of the frequency window remains; amber when &lt; 10% of the window remains (e.g. 7 of 90 days for quarterly = 7.7% =&gt; amber); red when the model is overdue (days remaining &lt; 0).</w:t>
+        <w:t>The inventory list displays two separate date-related columns for each model. The Due Date column shows the absolute calendar date of the next monitoring obligation, computed as Monitoring Start Date plus Monitoring Frequency and recalculated after each successful monitoring run. The Due Time / Duration column shows the days remaining until that obligation expressed relative to the monitoring period (e.g. "7 days / 90d" for a quarterly model with 7 days to go). The colour-coding logic for Due Time / Duration is: default neutral when &gt;= 10% of the frequency window remains; orange when &lt; 10% of the window remains (e.g. 7 of 90 days for quarterly = 7.7% =&gt; orange); red when the model is overdue (days remaining &lt; 0).</w:t>
       </w:r>
     </w:p>
     <w:tbl>

</xml_diff>

<commit_message>
Remove Admin-configurable category labels from WF1 BRD and wireframe: fixed labels only (Geography/Domain/Product), Section 4.5 and WF2-CAT requirements removed
</commit_message>
<xml_diff>
--- a/WF1_Manage_Model_Inventory_BRD.docx
+++ b/WF1_Manage_Model_Inventory_BRD.docx
@@ -84,7 +84,7 @@
           <w:sz w:val="20"/>
           <w:szCs w:val="20"/>
         </w:rPr>
-        <w:t xml:space="preserve">Inventory List • Bulk Upload • Single Add • Category Labels • Add Data • Soft Delete &amp; Restoration</w:t>
+        <w:t>Inventory List • Bulk Upload • Single Add • Add Data • Soft Delete &amp; Restoration</w:t>
       </w:r>
     </w:p>
     <w:tbl>
@@ -525,7 +525,7 @@
                 <w:sz w:val="20"/>
                 <w:szCs w:val="20"/>
               </w:rPr>
-              <w:t xml:space="preserve">Inventory list, bulk upload, single-model registration, downloadable template, category label configuration, Add Data, soft delete &amp; restoration request</w:t>
+              <w:t>Inventory list, bulk upload, single-model registration, downloadable template, Add Data, soft delete &amp; restoration request</w:t>
             </w:r>
           </w:p>
         </w:tc>
@@ -2783,7 +2783,6 @@
                 <w:sz w:val="20"/>
                 <w:szCs w:val="20"/>
               </w:rPr>
-              <w:t xml:space="preserve">    4.5  Category Label Configuration</w:t>
             </w:r>
           </w:p>
         </w:tc>
@@ -3646,7 +3645,6 @@
         <w:rPr>
           <w:rFonts w:ascii="Arial" w:cs="Arial" w:eastAsia="Arial" w:hAnsi="Arial"/>
         </w:rPr>
-        <w:t xml:space="preserve">Admin-configurable Category labels (Category, Sub Category 1, Sub Category 2 — defaulting to Geography, Domain, Product)</w:t>
       </w:r>
     </w:p>
     <w:p>
@@ -3931,7 +3929,7 @@
         <w:rPr>
           <w:rFonts w:ascii="Arial" w:cs="Arial" w:eastAsia="Arial" w:hAnsi="Arial"/>
         </w:rPr>
-        <w:t xml:space="preserve">Requirement identifiers in this document follow the pattern WF2-XXX-NNN, where XXX denotes the functional area (e.g., LST for inventory list, BLK for bulk upload, ADD for single add, CAT for category configuration, DEL for delete and restoration, AUD for audit). The keywords “must”, “shall”, and “will” denote mandatory requirements; “should” denotes recommended requirements; and “may” denotes optional requirements.</w:t>
+        <w:t>Requirement identifiers in this document follow the pattern WF2-XXX-NNN, where XXX denotes the functional area (e.g., LST for inventory list, BLK for bulk upload, ADD for single add, DEL for delete and restoration, AUD for audit). The keywords “must”, “shall”, and “will” denote mandatory requirements; “should” denotes recommended requirements; and “may” denotes optional requirements.</w:t>
       </w:r>
     </w:p>
     <w:p>
@@ -4042,7 +4040,6 @@
         <w:rPr>
           <w:rFonts w:ascii="Arial" w:cs="Arial" w:eastAsia="Arial" w:hAnsi="Arial"/>
         </w:rPr>
-        <w:t xml:space="preserve">Flexibility in classification through Admin-configurable Category labels that can be tailored to the organisation's preferred taxonomy</w:t>
       </w:r>
     </w:p>
     <w:p>
@@ -4699,7 +4696,6 @@
                 <w:sz w:val="20"/>
                 <w:szCs w:val="20"/>
               </w:rPr>
-              <w:t xml:space="preserve">5</w:t>
             </w:r>
           </w:p>
         </w:tc>
@@ -4733,7 +4729,6 @@
                 <w:sz w:val="20"/>
                 <w:szCs w:val="20"/>
               </w:rPr>
-              <w:t xml:space="preserve">Category label rename impact</w:t>
             </w:r>
           </w:p>
         </w:tc>
@@ -4767,7 +4762,6 @@
                 <w:sz w:val="20"/>
                 <w:szCs w:val="20"/>
               </w:rPr>
-              <w:t xml:space="preserve">Going forward only — existing models retain prior labels; new models use the renamed labels</w:t>
             </w:r>
           </w:p>
         </w:tc>
@@ -5812,7 +5806,6 @@
                 <w:sz w:val="20"/>
                 <w:szCs w:val="20"/>
               </w:rPr>
-              <w:t xml:space="preserve">2</w:t>
             </w:r>
           </w:p>
         </w:tc>
@@ -5846,7 +5839,6 @@
                 <w:sz w:val="20"/>
                 <w:szCs w:val="20"/>
               </w:rPr>
-              <w:t xml:space="preserve">Configure Category Labels (one-time / as needed)</w:t>
             </w:r>
           </w:p>
         </w:tc>
@@ -5880,7 +5872,6 @@
                 <w:sz w:val="20"/>
                 <w:szCs w:val="20"/>
               </w:rPr>
-              <w:t xml:space="preserve">Admin reviews and optionally renames the three Category labels (Category, Sub Category 1, Sub Category 2). Renames apply to new models only</w:t>
             </w:r>
           </w:p>
         </w:tc>
@@ -6839,7 +6830,6 @@
         <w:rPr>
           <w:rFonts w:ascii="Arial" w:cs="Arial" w:eastAsia="Arial" w:hAnsi="Arial"/>
         </w:rPr>
-        <w:t xml:space="preserve">Screen 6: Category Label Configuration</w:t>
       </w:r>
     </w:p>
     <w:p>
@@ -7225,7 +7215,7 @@
                 <w:sz w:val="20"/>
                 <w:szCs w:val="20"/>
               </w:rPr>
-              <w:t xml:space="preserve">Admin-configurable label; default “Geography”. Sourced from the model record</w:t>
+              <w:t>Fixed classification label; value: “Geography”. Sourced from the model record</w:t>
             </w:r>
           </w:p>
         </w:tc>
@@ -7329,7 +7319,7 @@
                 <w:sz w:val="20"/>
                 <w:szCs w:val="20"/>
               </w:rPr>
-              <w:t xml:space="preserve">Admin-configurable label; default “Domain”. Sourced from the model record</w:t>
+              <w:t>Fixed classification label; value: “Domain”. Sourced from the model record</w:t>
             </w:r>
           </w:p>
         </w:tc>
@@ -7433,7 +7423,7 @@
                 <w:sz w:val="20"/>
                 <w:szCs w:val="20"/>
               </w:rPr>
-              <w:t xml:space="preserve">Admin-configurable label; default “Product”. Sourced from the model record</w:t>
+              <w:t>Fixed classification label; value: “Product”. Sourced from the model record</w:t>
             </w:r>
           </w:p>
         </w:tc>
@@ -9627,7 +9617,7 @@
                 <w:sz w:val="20"/>
                 <w:szCs w:val="20"/>
               </w:rPr>
-              <w:t xml:space="preserve">Primary action buttons shall be visible at the top of the list: “Add Single Model”, “Bulk Upload”, “Download Template”, “Configure Category Labels”, “Export Inventory”.</w:t>
+              <w:t>Primary action buttons shall be visible at the top of the list: “Add Single Model”, “Bulk Upload”, “Download Template”, “Export Inventory”.</w:t>
             </w:r>
           </w:p>
         </w:tc>
@@ -10201,7 +10191,7 @@
                 <w:sz w:val="20"/>
                 <w:szCs w:val="20"/>
               </w:rPr>
-              <w:t xml:space="preserve">Default Label</w:t>
+              <w:t>Label</w:t>
             </w:r>
           </w:p>
         </w:tc>
@@ -13015,7 +13005,7 @@
                 <w:sz w:val="20"/>
                 <w:szCs w:val="20"/>
               </w:rPr>
-              <w:t xml:space="preserve">The schema validation shall use the Admin-configured Category labels (per section 4.5) when matching template columns at the time of upload. Renamed labels apply only to subsequent uploads (see section 4.5).</w:t>
+              <w:t>The schema validation shall use the fixed Category labels (Geography, Sub Category 1/Domain, Sub Category 2/Product) when matching template columns at the time of upload.</w:t>
             </w:r>
           </w:p>
         </w:tc>
@@ -14628,7 +14618,7 @@
                 <w:sz w:val="20"/>
                 <w:szCs w:val="20"/>
               </w:rPr>
-              <w:t xml:space="preserve">Geography (Category — configurable label)</w:t>
+              <w:t>Geography (Category)</w:t>
             </w:r>
           </w:p>
         </w:tc>
@@ -14662,7 +14652,7 @@
                 <w:sz w:val="20"/>
                 <w:szCs w:val="20"/>
               </w:rPr>
-              <w:t xml:space="preserve">Default Category label; Admin-configurable per section 4.5</w:t>
+              <w:t>Default Category label</w:t>
             </w:r>
           </w:p>
         </w:tc>
@@ -14732,7 +14722,7 @@
                 <w:sz w:val="20"/>
                 <w:szCs w:val="20"/>
               </w:rPr>
-              <w:t xml:space="preserve">Domain (Sub Category 1 — configurable label)</w:t>
+              <w:t>Domain (Sub Category 1)</w:t>
             </w:r>
           </w:p>
         </w:tc>
@@ -14766,7 +14756,7 @@
                 <w:sz w:val="20"/>
                 <w:szCs w:val="20"/>
               </w:rPr>
-              <w:t xml:space="preserve">Default Sub Category 1 label; Admin-configurable</w:t>
+              <w:t>Default Sub Category 1 label</w:t>
             </w:r>
           </w:p>
         </w:tc>
@@ -14836,7 +14826,7 @@
                 <w:sz w:val="20"/>
                 <w:szCs w:val="20"/>
               </w:rPr>
-              <w:t xml:space="preserve">Product (Sub Category 2 — configurable label)</w:t>
+              <w:t>Product (Sub Category 2)</w:t>
             </w:r>
           </w:p>
         </w:tc>
@@ -14870,7 +14860,7 @@
                 <w:sz w:val="20"/>
                 <w:szCs w:val="20"/>
               </w:rPr>
-              <w:t xml:space="preserve">Default Sub Category 2 label; Admin-configurable</w:t>
+              <w:t>Default Sub Category 2 label</w:t>
             </w:r>
           </w:p>
         </w:tc>
@@ -16972,7 +16962,7 @@
                 <w:sz w:val="20"/>
                 <w:szCs w:val="20"/>
               </w:rPr>
-              <w:t xml:space="preserve">The header row shall use the Admin-configured Category labels at the time of download (per section 4.5). The Required versus Optional designation shall be visually indicated (e.g., bold header, asterisk).</w:t>
+              <w:t>The header row shall use the fixed Category labels (Geography, Sub Category 1, Sub Category 2) and shall visually indicate the Required versus Optional designation (e.g., bold header, asterisk).</w:t>
             </w:r>
           </w:p>
         </w:tc>
@@ -17442,7 +17432,6 @@
           <w:sz w:val="26"/>
           <w:szCs w:val="26"/>
         </w:rPr>
-        <w:t xml:space="preserve">4.5 Category Label Configuration</w:t>
       </w:r>
     </w:p>
     <w:p>
@@ -17454,7 +17443,6 @@
         <w:rPr>
           <w:rFonts w:ascii="Arial" w:cs="Arial" w:eastAsia="Arial" w:hAnsi="Arial"/>
         </w:rPr>
-        <w:t xml:space="preserve">The three classification fields (Category, Sub Category 1, Sub Category 2) have default labels of Geography, Domain, and Product respectively. Admins may rename these labels to align with the organisation's preferred taxonomy. Renames apply going forward only — existing models retain the labels that were active at the time of their registration.</w:t>
       </w:r>
     </w:p>
     <w:p>
@@ -17527,7 +17515,6 @@
                 <w:sz w:val="20"/>
                 <w:szCs w:val="20"/>
               </w:rPr>
-              <w:t xml:space="preserve">Req ID</w:t>
             </w:r>
           </w:p>
         </w:tc>
@@ -17563,7 +17550,6 @@
                 <w:sz w:val="20"/>
                 <w:szCs w:val="20"/>
               </w:rPr>
-              <w:t xml:space="preserve">Requirement</w:t>
             </w:r>
           </w:p>
         </w:tc>
@@ -17599,7 +17585,6 @@
                 <w:sz w:val="20"/>
                 <w:szCs w:val="20"/>
               </w:rPr>
-              <w:t xml:space="preserve">Priority</w:t>
             </w:r>
           </w:p>
         </w:tc>
@@ -17635,7 +17620,6 @@
                 <w:sz w:val="20"/>
                 <w:szCs w:val="20"/>
               </w:rPr>
-              <w:t xml:space="preserve">WF2-CAT-001</w:t>
             </w:r>
           </w:p>
         </w:tc>
@@ -17669,7 +17653,6 @@
                 <w:sz w:val="20"/>
                 <w:szCs w:val="20"/>
               </w:rPr>
-              <w:t xml:space="preserve">The Admin shall be able to access a “Configure Category Labels” screen from the inventory list header.</w:t>
             </w:r>
           </w:p>
         </w:tc>
@@ -17703,7 +17686,6 @@
                 <w:sz w:val="20"/>
                 <w:szCs w:val="20"/>
               </w:rPr>
-              <w:t xml:space="preserve">Must</w:t>
             </w:r>
           </w:p>
         </w:tc>
@@ -17739,7 +17721,6 @@
                 <w:sz w:val="20"/>
                 <w:szCs w:val="20"/>
               </w:rPr>
-              <w:t xml:space="preserve">WF2-CAT-002</w:t>
             </w:r>
           </w:p>
         </w:tc>
@@ -17773,7 +17754,6 @@
                 <w:sz w:val="20"/>
                 <w:szCs w:val="20"/>
               </w:rPr>
-              <w:t xml:space="preserve">The screen shall display the current labels for Category, Sub Category 1, and Sub Category 2, along with an editable text field for each.</w:t>
             </w:r>
           </w:p>
         </w:tc>
@@ -17807,7 +17787,6 @@
                 <w:sz w:val="20"/>
                 <w:szCs w:val="20"/>
               </w:rPr>
-              <w:t xml:space="preserve">Must</w:t>
             </w:r>
           </w:p>
         </w:tc>
@@ -17843,7 +17822,6 @@
                 <w:sz w:val="20"/>
                 <w:szCs w:val="20"/>
               </w:rPr>
-              <w:t xml:space="preserve">WF2-CAT-003</w:t>
             </w:r>
           </w:p>
         </w:tc>
@@ -17877,7 +17855,6 @@
                 <w:sz w:val="20"/>
                 <w:szCs w:val="20"/>
               </w:rPr>
-              <w:t xml:space="preserve">Labels shall be alphanumeric (with spaces and hyphens) and shall be subject to a configurable maximum length (default 30 characters).</w:t>
             </w:r>
           </w:p>
         </w:tc>
@@ -17911,7 +17888,6 @@
                 <w:sz w:val="20"/>
                 <w:szCs w:val="20"/>
               </w:rPr>
-              <w:t xml:space="preserve">Must</w:t>
             </w:r>
           </w:p>
         </w:tc>
@@ -17947,7 +17923,6 @@
                 <w:sz w:val="20"/>
                 <w:szCs w:val="20"/>
               </w:rPr>
-              <w:t xml:space="preserve">WF2-CAT-004</w:t>
             </w:r>
           </w:p>
         </w:tc>
@@ -17981,7 +17956,6 @@
                 <w:sz w:val="20"/>
                 <w:szCs w:val="20"/>
               </w:rPr>
-              <w:t xml:space="preserve">On save, the new labels shall apply only to models registered after the save event. Existing models shall retain the labels that were active at the time of their registration.</w:t>
             </w:r>
           </w:p>
         </w:tc>
@@ -18015,7 +17989,6 @@
                 <w:sz w:val="20"/>
                 <w:szCs w:val="20"/>
               </w:rPr>
-              <w:t xml:space="preserve">Must</w:t>
             </w:r>
           </w:p>
         </w:tc>
@@ -18051,7 +18024,6 @@
                 <w:sz w:val="20"/>
                 <w:szCs w:val="20"/>
               </w:rPr>
-              <w:t xml:space="preserve">WF2-CAT-005</w:t>
             </w:r>
           </w:p>
         </w:tc>
@@ -18085,7 +18057,6 @@
                 <w:sz w:val="20"/>
                 <w:szCs w:val="20"/>
               </w:rPr>
-              <w:t xml:space="preserve">The screen shall display a clear, prominent warning before saving, explaining the going-forward-only behaviour and listing the current count of existing models that will retain their old labels.</w:t>
             </w:r>
           </w:p>
         </w:tc>
@@ -18119,7 +18090,6 @@
                 <w:sz w:val="20"/>
                 <w:szCs w:val="20"/>
               </w:rPr>
-              <w:t xml:space="preserve">Must</w:t>
             </w:r>
           </w:p>
         </w:tc>
@@ -18155,7 +18125,6 @@
                 <w:sz w:val="20"/>
                 <w:szCs w:val="20"/>
               </w:rPr>
-              <w:t xml:space="preserve">WF2-CAT-006</w:t>
             </w:r>
           </w:p>
         </w:tc>
@@ -18189,7 +18158,6 @@
                 <w:sz w:val="20"/>
                 <w:szCs w:val="20"/>
               </w:rPr>
-              <w:t xml:space="preserve">Each model record shall persist its label-set version so that the View Details panel and the exported inventory can render each model with its correct (historical) labels.</w:t>
             </w:r>
           </w:p>
         </w:tc>
@@ -18223,7 +18191,6 @@
                 <w:sz w:val="20"/>
                 <w:szCs w:val="20"/>
               </w:rPr>
-              <w:t xml:space="preserve">Must</w:t>
             </w:r>
           </w:p>
         </w:tc>
@@ -18259,7 +18226,6 @@
                 <w:sz w:val="20"/>
                 <w:szCs w:val="20"/>
               </w:rPr>
-              <w:t xml:space="preserve">WF2-CAT-007</w:t>
             </w:r>
           </w:p>
         </w:tc>
@@ -18293,7 +18259,6 @@
                 <w:sz w:val="20"/>
                 <w:szCs w:val="20"/>
               </w:rPr>
-              <w:t xml:space="preserve">The inventory list view shall display the label-set version active at registration in a tooltip on the column headers when models with mixed label sets are present in the list.</w:t>
             </w:r>
           </w:p>
         </w:tc>
@@ -18327,7 +18292,6 @@
                 <w:sz w:val="20"/>
                 <w:szCs w:val="20"/>
               </w:rPr>
-              <w:t xml:space="preserve">Should</w:t>
             </w:r>
           </w:p>
         </w:tc>
@@ -18363,7 +18327,6 @@
                 <w:sz w:val="20"/>
                 <w:szCs w:val="20"/>
               </w:rPr>
-              <w:t xml:space="preserve">WF2-CAT-008</w:t>
             </w:r>
           </w:p>
         </w:tc>
@@ -18397,7 +18360,6 @@
                 <w:sz w:val="20"/>
                 <w:szCs w:val="20"/>
               </w:rPr>
-              <w:t xml:space="preserve">Each label change shall be written to the audit log capturing: previous labels, new labels, Admin ID, timestamp, and the count of models retaining old labels at the time of the change.</w:t>
             </w:r>
           </w:p>
         </w:tc>
@@ -18431,7 +18393,6 @@
                 <w:sz w:val="20"/>
                 <w:szCs w:val="20"/>
               </w:rPr>
-              <w:t xml:space="preserve">Must</w:t>
             </w:r>
           </w:p>
         </w:tc>
@@ -18467,7 +18428,6 @@
                 <w:sz w:val="20"/>
                 <w:szCs w:val="20"/>
               </w:rPr>
-              <w:t xml:space="preserve">WF2-CAT-009</w:t>
             </w:r>
           </w:p>
         </w:tc>
@@ -18501,7 +18461,6 @@
                 <w:sz w:val="20"/>
                 <w:szCs w:val="20"/>
               </w:rPr>
-              <w:t xml:space="preserve">Renaming category labels shall not alter or affect any model's existing classification values — only the label under which those values are displayed for new models.</w:t>
             </w:r>
           </w:p>
         </w:tc>
@@ -18535,7 +18494,6 @@
                 <w:sz w:val="20"/>
                 <w:szCs w:val="20"/>
               </w:rPr>
-              <w:t xml:space="preserve">Must</w:t>
             </w:r>
           </w:p>
         </w:tc>
@@ -21840,7 +21798,7 @@
                 <w:sz w:val="20"/>
                 <w:szCs w:val="20"/>
               </w:rPr>
-              <w:t xml:space="preserve">Restored models shall return to the Active inventory with all original fields, monitoring history, and category labels intact (the historical labels active at registration are preserved).</w:t>
+              <w:t>Restored models shall return to the Active inventory with all original fields, monitoring history,.</w:t>
             </w:r>
           </w:p>
         </w:tc>
@@ -23409,7 +23367,6 @@
                 <w:sz w:val="20"/>
                 <w:szCs w:val="20"/>
               </w:rPr>
-              <w:t xml:space="preserve">Category labels changed</w:t>
             </w:r>
           </w:p>
         </w:tc>
@@ -23443,7 +23400,6 @@
                 <w:sz w:val="20"/>
                 <w:szCs w:val="20"/>
               </w:rPr>
-              <w:t xml:space="preserve">Previous labels, new labels, Admin ID, timestamp, count of models retaining old labels</w:t>
             </w:r>
           </w:p>
         </w:tc>
@@ -24797,7 +24753,7 @@
                 <w:sz w:val="20"/>
                 <w:szCs w:val="20"/>
               </w:rPr>
-              <w:t xml:space="preserve">All actions defined in this workflow (list view, search, filter, sort, export, single add, bulk upload, template download, category configuration, add data, delete, restoration request) shall be available only to authenticated users with the Admin role active.</w:t>
+              <w:t>All actions defined in this workflow (list view, search, filter, sort, export, single add, bulk upload, template download, add data, delete, restoration request) shall be available only to authenticated users with the Admin role active.</w:t>
             </w:r>
           </w:p>
         </w:tc>

</xml_diff>